<commit_message>
Add Jiahao rain event and five-turn authority boost
</commit_message>
<xml_diff>
--- a/downloads/cpho-events.docx
+++ b/downloads/cpho-events.docx
@@ -46,10 +46,7 @@
         </w:rPr>
       </w:pPr>
       <w:r>
-        <w:rPr>
-          <w:lang w:eastAsia="zh-CN"/>
-        </w:rPr>
-        <w:t>共18类可选择剧情事件，另附自动结算、比赛与游戏结束规则。内容按当前版本代码逐项整理；不是某一局随机生成的事件日程。</w:t>
+        <w:t>共19类可选择剧情事件，另附自动结算、比赛与游戏结束规则。内容按当前版本代码逐项整理；不是某一局随机生成的事件日程。</w:t>
       </w:r>
     </w:p>
     <w:p>
@@ -4631,6 +4628,38 @@
           </w:p>
         </w:tc>
       </w:tr>
+      <w:tr>
+        <w:tc>
+          <w:tcPr>
+            <w:tcW w:type="dxa" w:w="3213"/>
+          </w:tcPr>
+          <w:p>
+            <w:r>
+              <w:t>选项3：你是来挑战我的权威的吗？（嘉豪限定）</w:t>
+            </w:r>
+          </w:p>
+        </w:tc>
+        <w:tc>
+          <w:tcPr>
+            <w:tcW w:type="dxa" w:w="3213"/>
+          </w:tcPr>
+          <w:p>
+            <w:r>
+              <w:t>人缘−2；保持单身；从下一回合起连续5回合正收益×2</w:t>
+            </w:r>
+          </w:p>
+        </w:tc>
+        <w:tc>
+          <w:tcPr>
+            <w:tcW w:type="dxa" w:w="3213"/>
+          </w:tcPr>
+          <w:p>
+            <w:r>
+              <w:t>你昂起头，抛出一句令人错愕的反问。对方转身离开，你却进入了异常亢奋的状态。</w:t>
+            </w:r>
+          </w:p>
+        </w:tc>
+      </w:tr>
     </w:tbl>
     <w:p>
       <w:pPr>
@@ -5255,22 +5284,7 @@
         </w:rPr>
       </w:pPr>
       <w:r>
-        <w:rPr>
-          <w:lang w:eastAsia="zh-CN"/>
-        </w:rPr>
-        <w:t>五、天赋专属剧情（</w:t>
-      </w:r>
-      <w:r>
-        <w:rPr>
-          <w:lang w:eastAsia="zh-CN"/>
-        </w:rPr>
-        <w:t>1</w:t>
-      </w:r>
-      <w:r>
-        <w:rPr>
-          <w:lang w:eastAsia="zh-CN"/>
-        </w:rPr>
-        <w:t>类）</w:t>
+        <w:t>五、天赋专属剧情（2类）</w:t>
       </w:r>
     </w:p>
     <w:p>
@@ -5302,10 +5316,7 @@
         </w:rPr>
       </w:pPr>
       <w:r>
-        <w:rPr>
-          <w:lang w:eastAsia="zh-CN"/>
-        </w:rPr>
-        <w:t>触发条件：选择“天生嘉豪”时，生成该局日程的每个回合先以10%概率判定该事件。选中后纳入玩家和模拟角色共用日程。</w:t>
+        <w:t>触发条件：选择“天生嘉豪”时，每回合先判定10%的专属事件机会，随后在“嘉豪的独有时刻”与“暴雨中的狂欢”之间等概率抽取。选中后纳入玩家与模拟角色共用日程。</w:t>
       </w:r>
     </w:p>
     <w:p>
@@ -5551,6 +5562,137 @@
         </w:tc>
       </w:tr>
     </w:tbl>
+    <w:p>
+      <w:pPr>
+        <w:pStyle w:val="21"/>
+      </w:pPr>
+      <w:r>
+        <w:t>19  暴雨中的狂欢</w:t>
+      </w:r>
+    </w:p>
+    <w:p>
+      <w:r>
+        <w:t>触发条件：嘉豪专属事件机会（10%）触发后，与“嘉豪的独有时刻”等概率抽取。</w:t>
+      </w:r>
+    </w:p>
+    <w:p>
+      <w:r>
+        <w:t>突然下起暴雨，你却兴奋起来。此刻的操场，仿佛就是为你准备的舞台。</w:t>
+      </w:r>
+    </w:p>
+    <w:tbl>
+      <w:tblPr>
+        <w:tblStyle w:val="-1"/>
+        <w:tblW w:type="auto" w:w="0"/>
+        <w:tblLook w:firstColumn="1" w:firstRow="1" w:lastColumn="0" w:lastRow="0" w:noHBand="0" w:noVBand="1" w:val="04A0"/>
+      </w:tblPr>
+      <w:tblGrid>
+        <w:gridCol w:w="3213"/>
+        <w:gridCol w:w="3213"/>
+        <w:gridCol w:w="3213"/>
+      </w:tblGrid>
+      <w:tr>
+        <w:tc>
+          <w:tcPr>
+            <w:tcW w:type="dxa" w:w="3213"/>
+          </w:tcPr>
+          <w:p>
+            <w:r>
+              <w:t>选择</w:t>
+            </w:r>
+          </w:p>
+        </w:tc>
+        <w:tc>
+          <w:tcPr>
+            <w:tcW w:type="dxa" w:w="3213"/>
+          </w:tcPr>
+          <w:p>
+            <w:r>
+              <w:t>基础数值及状态变化</w:t>
+            </w:r>
+          </w:p>
+        </w:tc>
+        <w:tc>
+          <w:tcPr>
+            <w:tcW w:type="dxa" w:w="3213"/>
+          </w:tcPr>
+          <w:p>
+            <w:r>
+              <w:t>结果文案</w:t>
+            </w:r>
+          </w:p>
+        </w:tc>
+      </w:tr>
+      <w:tr>
+        <w:tc>
+          <w:tcPr>
+            <w:tcW w:type="dxa" w:w="3213"/>
+          </w:tcPr>
+          <w:p>
+            <w:r>
+              <w:t>选项1：雨中跳舞</w:t>
+            </w:r>
+          </w:p>
+        </w:tc>
+        <w:tc>
+          <w:tcPr>
+            <w:tcW w:type="dxa" w:w="3213"/>
+          </w:tcPr>
+          <w:p>
+            <w:r>
+              <w:t>心态+20；力学、电磁学、光学、热学、近代物理、文化课、实验各−1</w:t>
+            </w:r>
+          </w:p>
+        </w:tc>
+        <w:tc>
+          <w:tcPr>
+            <w:tcW w:type="dxa" w:w="3213"/>
+          </w:tcPr>
+          <w:p>
+            <w:r>
+              <w:t>你在雨中尽情起舞，随后生病了。快乐是真的，身体的不适也是真的。</w:t>
+            </w:r>
+          </w:p>
+        </w:tc>
+      </w:tr>
+      <w:tr>
+        <w:tc>
+          <w:tcPr>
+            <w:tcW w:type="dxa" w:w="3213"/>
+          </w:tcPr>
+          <w:p>
+            <w:r>
+              <w:t>选项2：还是算了吧</w:t>
+            </w:r>
+          </w:p>
+        </w:tc>
+        <w:tc>
+          <w:tcPr>
+            <w:tcW w:type="dxa" w:w="3213"/>
+          </w:tcPr>
+          <w:p>
+            <w:r>
+              <w:t>心态−5</w:t>
+            </w:r>
+          </w:p>
+        </w:tc>
+        <w:tc>
+          <w:tcPr>
+            <w:tcW w:type="dxa" w:w="3213"/>
+          </w:tcPr>
+          <w:p>
+            <w:r>
+              <w:t>你收回迈向雨中的脚，却被同学嘲笑：“这可不符合你的人设。”</w:t>
+            </w:r>
+          </w:p>
+        </w:tc>
+      </w:tr>
+    </w:tbl>
+    <w:p>
+      <w:r>
+        <w:t>生病体现为本次一次性属性扣减。天赋和身份的收益倍率、心态减耗仍按现有规则叠加。</w:t>
+      </w:r>
+    </w:p>
     <w:p>
       <w:pPr>
         <w:pStyle w:val="1"/>
@@ -6671,6 +6813,29 @@
     <w:p>
       <w:r>
         <w:t>每局1000次校准采用同一套新数值和固定事件日程；在心态低于35时优先休息，文化课低于40时优先补课，其余常规活动与事件选择随机。旧存档保留原有数值、事件日程和校准结果；重新开局采用本次规则。</w:t>
+      </w:r>
+    </w:p>
+    <w:p>
+      <w:pPr>
+        <w:pStyle w:val="1"/>
+      </w:pPr>
+      <w:r>
+        <w:t>十、权威宣言持续效果</w:t>
+      </w:r>
+    </w:p>
+    <w:p>
+      <w:r>
+        <w:t>嘉豪拒绝告白并挑战权威时，人缘−2且保持单身，从下一回合起连续5回合正收益×2；在当前回合不提前生效。持续时间按本局累计回合计算，跨年级切换继续有效。再次触发刷新为随后5回合，倍率保持×2。</w:t>
+      </w:r>
+    </w:p>
+    <w:p>
+      <w:r>
+        <w:t>翻倍覆盖常规行动、事件正收益和按常规收益计算的恋爱日常回复，包括心态、人缘，并与已有行动正收益减半及天赋倍率相乘。每日固定自然回复、文化课固定每日影响、迷失固定回复、家财万贯周期奖励和考试分数按原机制结算。</w:t>
+      </w:r>
+    </w:p>
+    <w:p>
+      <w:r>
+        <w:t>加成剩余回合在角色栏显示，刷新保存且到期自动结束。每局的固定事件日程纳入嘉豪的两类专属事件与三选项告白；1000名模拟角色共享同一内容，并根据各自选择独立获得持续效果。旧存档沿用原有嘉豪事件与日程，重新开局启用。</w:t>
       </w:r>
     </w:p>
     <w:sectPr>

</xml_diff>

<commit_message>
Calibrate ten thousand players at top ten percent and reduce all-in bonus
</commit_message>
<xml_diff>
--- a/downloads/cpho-events.docx
+++ b/downloads/cpho-events.docx
@@ -96,10 +96,7 @@
         </w:rPr>
       </w:pPr>
       <w:r>
-        <w:rPr>
-          <w:lang w:eastAsia="zh-CN"/>
-        </w:rPr>
-        <w:t>新开局预先生成36回合日程；选择“赢在起跑线”则为48回合。玩家和1000名模拟角色共用日程。同样关系条件下出现相同内容和能力门槛，但选择与属性可以不同。读档不重抽日程。</w:t>
+        <w:t>新开局预先生成36回合日程；选择“赢在起跑线”则为48回合。玩家和10000名模拟角色共用日程。同样关系条件下出现相同内容和能力门槛，但选择与属性可以不同。读档不重抽日程。</w:t>
       </w:r>
     </w:p>
     <w:p>
@@ -6333,10 +6330,7 @@
         </w:rPr>
       </w:pPr>
       <w:r>
-        <w:rPr>
-          <w:lang w:eastAsia="zh-CN"/>
-        </w:rPr>
-        <w:t>“坠机体质”考试扣分：5%扣120、10%扣80、25%扣60、50%扣40、10%不扣；在心态折算后扣分，最低0。各场考试分数线独立统计。模拟参赛池共1000人：初三450、高一350、高二200；高一和高二分别先积累12、24回合学习。</w:t>
+        <w:t>“坠机体质”考试扣分：5%扣120、10%扣80、25%扣60、50%扣40、10%不扣；在心态折算后扣分，最低0。各场考试分数线独立统计。模拟参赛池共10000人：初三4500、高一3500、高二2000；高一和高二分别先积累12、24回合学习。</w:t>
       </w:r>
     </w:p>
     <w:p>
@@ -6549,19 +6543,8 @@
             <w:tcW w:w="4819" w:type="dxa"/>
           </w:tcPr>
           <w:p>
-            <w:pPr>
-              <w:spacing w:after="60"/>
-              <w:cnfStyle w:val="000000100000" w:firstRow="0" w:lastRow="0" w:firstColumn="0" w:lastColumn="0" w:oddVBand="0" w:evenVBand="0" w:oddHBand="1" w:evenHBand="0" w:firstRowFirstColumn="0" w:firstRowLastColumn="0" w:lastRowFirstColumn="0" w:lastRowLastColumn="0"/>
-              <w:rPr>
-                <w:lang w:eastAsia="zh-CN"/>
-              </w:rPr>
-            </w:pPr>
-            <w:r>
-              <w:rPr>
-                <w:sz w:val="19"/>
-                <w:lang w:eastAsia="zh-CN"/>
-              </w:rPr>
-              <w:t>剧情中力学、电磁学、热学、光学、近代物理和实验的正收益×2；文化课始终保持0，文化课正负变化均不能改变它。</w:t>
+            <w:r>
+              <w:t>剧情中力学、电磁学、热学、光学、近代物理和实验的正收益提高50%（×1.5）；文化课始终保持0，文化课正负变化均不能改变它。</w:t>
             </w:r>
           </w:p>
         </w:tc>
@@ -6812,7 +6795,7 @@
     </w:p>
     <w:p>
       <w:r>
-        <w:t>每局1000次校准采用同一套新数值和固定事件日程；在心态低于35时优先休息，文化课低于40时优先补课，其余常规活动与事件选择随机。旧存档保留原有数值、事件日程和校准结果；重新开局采用本次规则。</w:t>
+        <w:t>每局10000次校准采用同一套新数值和固定事件日程；在心态低于35时优先休息，文化课低于40时优先补课，其余常规活动与事件选择随机。旧存档保留原有数值、事件日程和校准结果；重新开局采用本次规则。</w:t>
       </w:r>
     </w:p>
     <w:p>
@@ -6835,7 +6818,20 @@
     </w:p>
     <w:p>
       <w:r>
-        <w:t>加成剩余回合在角色栏显示，刷新保存且到期自动结束。每局的固定事件日程纳入嘉豪的两类专属事件与三选项告白；1000名模拟角色共享同一内容，并根据各自选择独立获得持续效果。旧存档沿用原有嘉豪事件与日程，重新开局启用。</w:t>
+        <w:t>加成剩余回合在角色栏显示，刷新保存且到期自动结束。每局的固定事件日程纳入嘉豪的两类专属事件与三选项告白；10000名模拟角色共享同一内容，并根据各自选择独立获得持续效果。旧存档沿用原有嘉豪事件与日程，重新开局启用。</w:t>
+      </w:r>
+    </w:p>
+    <w:p>
+      <w:pPr>
+        <w:pStyle w:val="1"/>
+      </w:pPr>
+      <w:r>
+        <w:t>分数线规则更新</w:t>
+      </w:r>
+    </w:p>
+    <w:p>
+      <w:r>
+        <w:t>每局模拟10000名无天赋、随机身份角色。预赛前10%晋级复赛，复赛前10%晋级决赛；决赛前10%、30%、70%分别为集训队、金牌、银牌分界。混合年级比例、计分权重、心态发挥模型和其他事件参数保持不变。新局破釜沉舟的物竞正收益提高50%（×1.5）；旧存档保留原校准结果与倍率。</w:t>
       </w:r>
     </w:p>
     <w:sectPr>

</xml_diff>

<commit_message>
Raise crash talent bonus and revise exam penalty probabilities
</commit_message>
<xml_diff>
--- a/downloads/cpho-events.docx
+++ b/downloads/cpho-events.docx
@@ -6330,7 +6330,7 @@
         </w:rPr>
       </w:pPr>
       <w:r>
-        <w:t>“坠机体质”考试扣分：5%扣120、10%扣80、25%扣60、50%扣40、10%不扣；在心态折算后扣分，最低0。各场考试分数线独立统计。模拟参赛池共10000人：初三4500、高一3500、高二2000；高一和高二分别先积累12、24回合学习。</w:t>
+        <w:t>“坠机体质”考试扣分：5%扣120、10%扣80、15%扣60、20%扣40、25%扣20、25%不扣；在心态折算后扣分，最低0。各场考试分数线独立统计。模拟参赛池共10000人：初三4500、高一3500、高二2000；高一和高二分别先积累12、24回合学习。</w:t>
       </w:r>
     </w:p>
     <w:p>
@@ -6497,19 +6497,8 @@
             <w:tcW w:w="4819" w:type="dxa"/>
           </w:tcPr>
           <w:p>
-            <w:pPr>
-              <w:spacing w:after="60"/>
-              <w:cnfStyle w:val="000000000000" w:firstRow="0" w:lastRow="0" w:firstColumn="0" w:lastColumn="0" w:oddVBand="0" w:evenVBand="0" w:oddHBand="0" w:evenHBand="0" w:firstRowFirstColumn="0" w:firstRowLastColumn="0" w:lastRowFirstColumn="0" w:lastRowLastColumn="0"/>
-              <w:rPr>
-                <w:lang w:eastAsia="zh-CN"/>
-              </w:rPr>
-            </w:pPr>
-            <w:r>
-              <w:rPr>
-                <w:sz w:val="19"/>
-                <w:lang w:eastAsia="zh-CN"/>
-              </w:rPr>
-              <w:t>剧情的正收益×1.25；负收益不变。另有考试扣分，见上节。</w:t>
+            <w:r>
+              <w:t>剧情的正收益×1.5；负收益不变。另有考试扣分，见上节。 描述：Man！新开局启用，旧存档沿用原规则。</w:t>
             </w:r>
           </w:p>
         </w:tc>

</xml_diff>

<commit_message>
Rebuild independent reference populations for every competition cutoff
</commit_message>
<xml_diff>
--- a/downloads/cpho-events.docx
+++ b/downloads/cpho-events.docx
@@ -6784,7 +6784,7 @@
     </w:p>
     <w:p>
       <w:r>
-        <w:t>每局10000次校准采用同一套新数值和固定事件日程；在心态低于35时优先休息，文化课低于40时优先补课，其余常规活动与事件选择随机。旧存档保留原有数值、事件日程和校准结果；重新开局采用本次规则。</w:t>
+        <w:t>每场比赛独立10000人校准采用同一套新数值和固定事件日程；在心态低于35时优先休息，文化课低于40时优先补课，其余常规活动与事件选择随机。旧存档保留原有数值、事件日程和校准结果；重新开局采用本次规则。</w:t>
       </w:r>
     </w:p>
     <w:p>
@@ -6820,7 +6820,20 @@
     </w:p>
     <w:p>
       <w:r>
-        <w:t>每局模拟10000名无天赋、随机身份角色。预赛前10%晋级复赛，复赛前10%晋级决赛；决赛前10%、30%、70%分别为集训队、金牌、银牌分界。混合年级比例、计分权重、心态发挥模型和其他事件参数保持不变。新局破釜沉舟的物竞正收益提高50%（×1.5）；旧存档保留原校准结果与倍率。</w:t>
+        <w:t>每场比赛独立模拟10000名无天赋、随机身份角色。预赛前10%晋级复赛，复赛前10%晋级决赛；决赛前10%、30%、70%分别为集训队、金牌、银牌分界。混合年级比例、计分权重、心态发挥模型和其他事件参数保持不变。新局破釜沉舟的物竞正收益提高50%（×1.5）；旧存档保留原校准结果与倍率。</w:t>
+      </w:r>
+    </w:p>
+    <w:p>
+      <w:pPr>
+        <w:pStyle w:val="1"/>
+      </w:pPr>
+      <w:r>
+        <w:t>独立参赛池修正</w:t>
+      </w:r>
+    </w:p>
+    <w:p>
+      <w:r>
+        <w:t>每个年级的预赛、复赛、决赛各自重新生成10000名角色（初三4500、高一3500、高二2000），不继承其他场次或上一年的属性、关系和持续加成。各池保留0、12、24回合初始学习差异，仅重演本局该年度事件窗口；复赛池与决赛池在各自池内重演当年的前置晋级流程。基础赛程9场共90000人次，起跑线12场共120000人次，在开局后台完成并保存。旧存档不重算，重新开局启用修正算法。</w:t>
       </w:r>
     </w:p>
     <w:sectPr>

</xml_diff>

<commit_message>
Improve reference player planning and snapshot exam score calculations
</commit_message>
<xml_diff>
--- a/downloads/cpho-events.docx
+++ b/downloads/cpho-events.docx
@@ -6784,7 +6784,7 @@
     </w:p>
     <w:p>
       <w:r>
-        <w:t>每场比赛独立10000人校准采用同一套新数值和固定事件日程；在心态低于35时优先休息，文化课低于40时优先补课，其余常规活动与事件选择随机。旧存档保留原有数值、事件日程和校准结果；重新开局采用本次规则。</w:t>
+        <w:t>每场比赛独立10000人校准采用同一套数值和当年固定事件日程。新版参考角色根据近期考试权重、学科短板及当前心态规划完整行动点预算，事件选择遵守能力门槛并回避致死选项；不同人物保留不同学习偏好及文化课取舍。没有额外属性或行动点加成。旧存档保留原校准结果，重新开局使用策略版。</w:t>
       </w:r>
     </w:p>
     <w:p>
@@ -6834,6 +6834,19 @@
     <w:p>
       <w:r>
         <w:t>每个年级的预赛、复赛、决赛各自重新生成10000名角色（初三4500、高一3500、高二2000），不继承其他场次或上一年的属性、关系和持续加成。各池保留0、12、24回合初始学习差异，仅重演本局该年度事件窗口；复赛池与决赛池在各自池内重演当年的前置晋级流程。基础赛程9场共90000人次，起跑线12场共120000人次，在开局后台完成并保存。旧存档不重算，重新开局启用修正算法。</w:t>
+      </w:r>
+    </w:p>
+    <w:p>
+      <w:pPr>
+        <w:pStyle w:val="1"/>
+      </w:pPr>
+      <w:r>
+        <w:t>考试成绩核对</w:t>
+      </w:r>
+    </w:p>
+    <w:p>
+      <w:r>
+        <w:t>考试记录保存本场分数线和身份倍率，结果弹窗只显示当前阶段的阈值。坠机时显示扣分前成绩、扣分值和最终成绩。强省强校仅把预赛、复赛晋级线提高30%，决赛奖项线不受该倍率影响。</w:t>
       </w:r>
     </w:p>
     <w:sectPr>

</xml_diff>

<commit_message>
Replace Master automatic qualification with cutoff-based score bonuses
</commit_message>
<xml_diff>
--- a/downloads/cpho-events.docx
+++ b/downloads/cpho-events.docx
@@ -6229,19 +6229,8 @@
             <w:tcW w:w="3213" w:type="dxa"/>
           </w:tcPr>
           <w:p>
-            <w:pPr>
-              <w:spacing w:after="60"/>
-              <w:cnfStyle w:val="000000000000" w:firstRow="0" w:lastRow="0" w:firstColumn="0" w:lastColumn="0" w:oddVBand="0" w:evenVBand="0" w:oddHBand="0" w:evenHBand="0" w:firstRowFirstColumn="0" w:firstRowLastColumn="0" w:lastRowFirstColumn="0" w:lastRowLastColumn="0"/>
-              <w:rPr>
-                <w:lang w:eastAsia="zh-CN"/>
-              </w:rPr>
-            </w:pPr>
-            <w:r>
-              <w:rPr>
-                <w:sz w:val="19"/>
-                <w:lang w:eastAsia="zh-CN"/>
-              </w:rPr>
-              <w:t>满分400；按当场独立校准线晋级决赛。“大手”有20%概率无视分数晋级。</w:t>
+            <w:r>
+              <w:t>满分400；按当场独立校准线晋级决赛。新版“大手”复赛成绩增加当场复赛线的1/3，决赛成绩增加当场集训队线的1/4；心态折算后加分，四舍五入且不超过满分，再扣坠机分数。旧存档保留原概率机制。</w:t>
             </w:r>
           </w:p>
         </w:tc>

</xml_diff>

<commit_message>
Apply fixed mood changes after preliminary and semifinal results
</commit_message>
<xml_diff>
--- a/downloads/cpho-events.docx
+++ b/downloads/cpho-events.docx
@@ -6836,6 +6836,19 @@
     <w:p>
       <w:r>
         <w:t>考试记录保存本场分数线和身份倍率，结果弹窗只显示当前阶段的阈值。坠机时显示扣分前成绩、扣分值和最终成绩。强省强校仅把预赛、复赛晋级线提高30%，决赛奖项线不受该倍率影响。</w:t>
+      </w:r>
+    </w:p>
+    <w:p>
+      <w:pPr>
+        <w:pStyle w:val="21"/>
+      </w:pPr>
+      <w:r>
+        <w:t>比赛结果的固定心态结算（新版）</w:t>
+      </w:r>
+    </w:p>
+    <w:p>
+      <w:r>
+        <w:t>所有角色预赛晋级心态+10，未晋级心态−20；复赛晋级心态+20，未晋级心态−30；决赛无新增心态变化。先使用考前心态计算成绩，再按比赛结果固定结算心态，然后处理当天事件。这项变化不受天赋、身份、行动收益减半、活动判定或权威加成影响，心态限制在0～100，扣到0立即GAMEOVER。新局模拟池按当场真实排名结算同样的心态变化。读档不重复结算，旧存档保留原规则。</w:t>
       </w:r>
     </w:p>
     <w:sectPr>

</xml_diff>

<commit_message>
Update starting identity bonuses to revised document values
</commit_message>
<xml_diff>
--- a/downloads/cpho-events.docx
+++ b/downloads/cpho-events.docx
@@ -6580,17 +6580,9 @@
             <w:tcW w:w="4819" w:type="dxa"/>
           </w:tcPr>
           <w:p>
-            <w:pPr>
-              <w:spacing w:after="60"/>
-            </w:pPr>
-            <w:proofErr w:type="spellStart"/>
-            <w:r>
-              <w:rPr>
-                <w:sz w:val="19"/>
-              </w:rPr>
+            <w:r>
               <w:t>强省强校</w:t>
             </w:r>
-            <w:proofErr w:type="spellEnd"/>
           </w:p>
         </w:tc>
         <w:tc>
@@ -6598,19 +6590,8 @@
             <w:tcW w:w="4819" w:type="dxa"/>
           </w:tcPr>
           <w:p>
-            <w:pPr>
-              <w:spacing w:after="60"/>
-              <w:cnfStyle w:val="000000100000" w:firstRow="0" w:lastRow="0" w:firstColumn="0" w:lastColumn="0" w:oddVBand="0" w:evenVBand="0" w:oddHBand="1" w:evenHBand="0" w:firstRowFirstColumn="0" w:firstRowLastColumn="0" w:lastRowFirstColumn="0" w:lastRowLastColumn="0"/>
-              <w:rPr>
-                <w:lang w:eastAsia="zh-CN"/>
-              </w:rPr>
-            </w:pPr>
-            <w:r>
-              <w:rPr>
-                <w:sz w:val="19"/>
-                <w:lang w:eastAsia="zh-CN"/>
-              </w:rPr>
-              <w:t>所有负心态变化×1.1；其学习正收益+20%仅作用于常规学习活动，不提高剧情奖励。</w:t>
+            <w:r>
+              <w:t>所有负心态变化×1.1；其学习正收益+10%仅作用于常规学习活动，不提高剧情奖励。</w:t>
             </w:r>
           </w:p>
         </w:tc>
@@ -6625,17 +6606,9 @@
             <w:tcW w:w="4819" w:type="dxa"/>
           </w:tcPr>
           <w:p>
-            <w:pPr>
-              <w:spacing w:after="60"/>
-            </w:pPr>
-            <w:proofErr w:type="spellStart"/>
-            <w:r>
-              <w:rPr>
-                <w:sz w:val="19"/>
-              </w:rPr>
+            <w:r>
               <w:t>天赋怪</w:t>
             </w:r>
-            <w:proofErr w:type="spellEnd"/>
           </w:p>
         </w:tc>
         <w:tc>
@@ -6643,19 +6616,8 @@
             <w:tcW w:w="4819" w:type="dxa"/>
           </w:tcPr>
           <w:p>
-            <w:pPr>
-              <w:spacing w:after="60"/>
-              <w:cnfStyle w:val="000000000000" w:firstRow="0" w:lastRow="0" w:firstColumn="0" w:lastColumn="0" w:oddVBand="0" w:evenVBand="0" w:oddHBand="0" w:evenHBand="0" w:firstRowFirstColumn="0" w:firstRowLastColumn="0" w:lastRowFirstColumn="0" w:lastRowLastColumn="0"/>
-              <w:rPr>
-                <w:lang w:eastAsia="zh-CN"/>
-              </w:rPr>
-            </w:pPr>
-            <w:r>
-              <w:rPr>
-                <w:sz w:val="19"/>
-                <w:lang w:eastAsia="zh-CN"/>
-              </w:rPr>
-              <w:t>学习正收益+15%仅作用于常规学习活动，不提高剧情奖励。</w:t>
+            <w:r>
+              <w:t>学习正收益+5%仅作用于常规学习活动，不提高剧情奖励。</w:t>
             </w:r>
           </w:p>
         </w:tc>
@@ -6849,6 +6811,11 @@
     <w:p>
       <w:r>
         <w:t>所有角色预赛晋级心态+10，未晋级心态−20；复赛晋级心态+20，未晋级心态−30；决赛无新增心态变化。先使用考前心态计算成绩，再按比赛结果固定结算心态，然后处理当天事件。这项变化不受天赋、身份、行动收益减半、活动判定或权威加成影响，心态限制在0～100，扣到0立即GAMEOVER。新局模拟池按当场真实排名结算同样的心态变化。读档不重复结算，旧存档保留原规则。</w:t>
+      </w:r>
+    </w:p>
+    <w:p>
+      <w:r>
+        <w:t>新版初始身份按《开局身份.docx》调整：强省强校学习收益+10%，天赋怪学习收益+5%，一般路过每回合行动点+1；强省强校预赛和复赛晋级线+30%、心态消耗+10%及三项身份描述保持不变。新开局的所有模拟参赛者同步使用这些参数。旧存档保留原身份效果，重新开局启用新版。</w:t>
       </w:r>
     </w:p>
     <w:sectPr>

</xml_diff>

<commit_message>
Halve action mood costs and reduce base daily action points to four
</commit_message>
<xml_diff>
--- a/downloads/cpho-events.docx
+++ b/downloads/cpho-events.docx
@@ -6816,6 +6816,11 @@
     <w:p>
       <w:r>
         <w:t>新版初始身份按《开局身份.docx》调整：强省强校学习收益+10%，天赋怪学习收益+5%，一般路过每回合行动点+1；强省强校预赛和复赛晋级线+30%、心态消耗+10%及三项身份描述保持不变。新开局的所有模拟参赛者同步使用这些参数。旧存档保留原身份效果，重新开局启用新版。</w:t>
+      </w:r>
+    </w:p>
+    <w:p>
+      <w:r>
+        <w:t>新版常规行动：每回合基础行动点由6降为4，卷卷、身份加点及恋爱、迷失扣点继续叠加。力学／电磁学心态消耗−2.5，热学／光学／近代物理−2，实验−1.5，文化课−0.5；再按身份、天赋和活动判定结算。散步心态回复、事件奖励／惩罚、考后心态及每日自然回复按原机制。新局模拟角色同步使用这些参数，旧存档保留旧规则。</w:t>
       </w:r>
     </w:p>
     <w:sectPr>

</xml_diff>

<commit_message>
Revise identities and reduce non-mood action gains by one third
</commit_message>
<xml_diff>
--- a/downloads/cpho-events.docx
+++ b/downloads/cpho-events.docx
@@ -6591,7 +6591,7 @@
           </w:tcPr>
           <w:p>
             <w:r>
-              <w:t>所有负心态变化×1.1；其学习正收益+10%仅作用于常规学习活动，不提高剧情奖励。</w:t>
+              <w:t>所有负心态变化×1.15；其学习正收益+10%仅作用于常规学习活动，不提高剧情奖励。</w:t>
             </w:r>
           </w:p>
         </w:tc>
@@ -6676,7 +6676,7 @@
         </w:rPr>
       </w:pPr>
       <w:r>
-        <w:t>符合条件的倍率乘法叠加。例：“天生嘉豪”＋“强省强校”的失恋−10实际为−10×0.8×1.1＝−8.8。其他属性及心态范围为0～100，财富最低0且无100上限，因上限或下限造成的实际增减可能小于表中值。</w:t>
+        <w:t>符合条件的倍率乘法叠加。例：“天生嘉豪”＋“强省强校”的失恋−10实际为−10×0.8×1.15＝−9.2。其他属性及心态范围为0～100，财富最低0且无100上限，因上限或下限造成的实际增减可能小于表中值。</w:t>
       </w:r>
     </w:p>
     <w:p>
@@ -6715,12 +6715,12 @@
     </w:p>
     <w:p>
       <w:r>
-        <w:t>所有常规行动（力学、电磁学、热学、光学、近代物理、实验、文化课与散步）的正收益，在原值基础上减半，包含心态回复；负收益和行动点消耗不变。事件选项按本文表格执行，不额外减半。精神错乱随机偏移后按正负进行减半，再叠加活动大成功／大失败倍率。</w:t>
+        <w:t>所有常规行动的正收益先按已有规则减半，再将心态以外的正收益乘2/3；心态回复不额外缩小。精神错乱先随机偏移再按正负判断，负学习收益不变，行动负心态沿用减半规则。身份、天赋和大成功／大失败继续叠加。事件选项按本文表格执行，不受行动收益倍率影响。</w:t>
       </w:r>
     </w:p>
     <w:p>
       <w:r>
-        <w:t>基础预览：五项理论训练各+1.5，实验+5/3，文化课+1；散步心态+1、文化课+1/6。天赋与身份倍率仍然有效，分数精度在游戏内保留。</w:t>
+        <w:t>基础预览（无身份／天赋加成）：五项理论训练各+1，实验+10/9，文化课+2/3；散步心态+1、文化课+1/9。天赋与身份倍率仍然有效，分数精度在游戏内保留。</w:t>
       </w:r>
     </w:p>
     <w:p>
@@ -6815,7 +6815,7 @@
     </w:p>
     <w:p>
       <w:r>
-        <w:t>新版初始身份按《开局身份.docx》调整：强省强校学习收益+10%，天赋怪学习收益+5%，一般路过每回合行动点+1；强省强校预赛和复赛晋级线+30%、心态消耗+10%及三项身份描述保持不变。新开局的所有模拟参赛者同步使用这些参数。旧存档保留原身份效果，重新开局启用新版。</w:t>
+        <w:t>新版初始身份：强省强校学习收益+10%、预赛和复赛晋级线+30%、负心态变化增加15%；天赋怪学习收益+10%；一般路过仅第2、4、6……回合额外1行动点，不累积。三项身份描述保持不变。新局模拟角色同步使用参数，包含年级初始学习阶段；旧存档保留原规则，重新开局启用。</w:t>
       </w:r>
     </w:p>
     <w:p>

</xml_diff>

<commit_message>
Update elite identity and make training-team admission a victory
</commit_message>
<xml_diff>
--- a/downloads/cpho-events.docx
+++ b/downloads/cpho-events.docx
@@ -6591,7 +6591,7 @@
           </w:tcPr>
           <w:p>
             <w:r>
-              <w:t>所有负心态变化×1.15；其学习正收益+10%仅作用于常规学习活动，不提高剧情奖励。</w:t>
+              <w:t>所有负心态变化×1.1；其学习正收益+15%仅作用于常规学习活动，不提高剧情奖励。</w:t>
             </w:r>
           </w:p>
         </w:tc>
@@ -6676,7 +6676,7 @@
         </w:rPr>
       </w:pPr>
       <w:r>
-        <w:t>符合条件的倍率乘法叠加。例：“天生嘉豪”＋“强省强校”的失恋−10实际为−10×0.8×1.15＝−9.2。其他属性及心态范围为0～100，财富最低0且无100上限，因上限或下限造成的实际增减可能小于表中值。</w:t>
+        <w:t>符合条件的倍率乘法叠加。例：“天生嘉豪”＋“强省强校”的失恋−10实际为−10×0.8×1.1＝−8.8。其他属性及心态范围为0～100，财富最低0且无100上限，因上限或下限造成的实际增减可能小于表中值。</w:t>
       </w:r>
     </w:p>
     <w:p>
@@ -6815,12 +6815,17 @@
     </w:p>
     <w:p>
       <w:r>
-        <w:t>新版初始身份：强省强校学习收益+10%、预赛和复赛晋级线+30%、负心态变化增加15%；天赋怪学习收益+10%；一般路过仅第2、4、6……回合额外1行动点，不累积。三项身份描述保持不变。新局模拟角色同步使用参数，包含年级初始学习阶段；旧存档保留原规则，重新开局启用。</w:t>
+        <w:t>新版初始身份：强省强校学习收益+15%、预赛和复赛晋级线+30%、负心态变化增加10%；天赋怪学习收益+10%；一般路过仅第2、4、6……回合额外1行动点，不累积。三项身份描述保持不变。新局模拟角色同步使用参数，包含年级初始学习阶段；旧存档保留原规则，重新开局启用。</w:t>
       </w:r>
     </w:p>
     <w:p>
       <w:r>
         <w:t>新版常规行动：每回合基础行动点由6降为4，卷卷、身份加点及恋爱、迷失扣点继续叠加。力学／电磁学心态消耗−2.5，热学／光学／近代物理−2，实验−1.5，文化课−0.5；再按身份、天赋和活动判定结算。散步心态回复、事件奖励／惩罚、考后心态及每日自然回复按原机制。新局模拟角色同步使用这些参数，旧存档保留旧规则。</w:t>
+      </w:r>
+    </w:p>
+    <w:p>
+      <w:r>
+        <w:t>决赛达到集训队线时，获奖结果显示“进入集训队”，立即游戏胜利，不再触发当天事件或推进后续回合。判定使用大手加分及坠机扣分后的最终成绩；未达到集训队线的金牌继续原有流程。</w:t>
       </w:r>
     </w:p>
     <w:sectPr>

</xml_diff>